<commit_message>
fix: 14주차 날짜 정리 (월3/30 화3/31 수4/1 목4/2 금4/3)
Co-Authored-By: Claude Opus 4.6 (1M context) <noreply@anthropic.com>
</commit_message>
<xml_diff>
--- a/서울남부_33주년_증정기획전.docx
+++ b/서울남부_33주년_증정기획전.docx
@@ -75,7 +75,7 @@
           <w:sz w:val="24"/>
           <w:szCs w:val="24"/>
         </w:rPr>
-        <w:t>행사기간: 2026년 3월 31일(월) ~ 4월 4일(금)</w:t>
+        <w:t>행사기간: 2026년 3월 30일(월) ~ 4월 3일(금)</w:t>
       </w:r>
     </w:p>
     <w:p>
@@ -2422,7 +2422,7 @@
                 <w:sz w:val="20"/>
                 <w:szCs w:val="20"/>
               </w:rPr>
-              <w:t>2026년 3월 31일(월) ~ 4월 4일(금), 5일간</w:t>
+              <w:t>2026년 3월 30일(월) ~ 4월 3일(금), 5일간</w:t>
             </w:r>
           </w:p>
         </w:tc>
@@ -5849,7 +5849,7 @@
                 <w:sz w:val="20"/>
                 <w:szCs w:val="20"/>
               </w:rPr>
-              <w:t>3/30(일) + 4/2(수)</w:t>
+              <w:t>3/30(일) + 4/1(수)</w:t>
             </w:r>
           </w:p>
         </w:tc>
@@ -6242,7 +6242,7 @@
           <w:rFonts w:eastAsia="Arial"/>
           <w:color w:val="000000"/>
         </w:rPr>
-        <w:t xml:space="preserve">3/31(월)~4/4(금) 요일별 구매금액 달성 시 봄 </w:t>
+        <w:t xml:space="preserve">3/30(월)~4/3(금) 요일별 구매금액 달성 시 봄 </w:t>
       </w:r>
       <w:proofErr w:type="spellStart"/>
       <w:r>

</xml_diff>